<commit_message>
Refactor Lab 6.3: separate functions for array creation, output, and recursive calculation per instructor feedback
</commit_message>
<xml_diff>
--- a/АП_РІ-13_Шах_ЛР-06.3.рек.docx
+++ b/АП_РІ-13_Шах_ЛР-06.3.рек.docx
@@ -1078,15 +1078,18 @@
             </w:tcBorders>
           </w:tcPr>
           <w:p>
-            <w:pPr>
-              <w:spacing w:before="0" w:after="0" w:line="240" w:lineRule="auto"/>
-            </w:pPr>
             <w:r>
-              <w:rPr>
-                <w:rFonts w:ascii="Consolas" w:hAnsi="Consolas"/>
-                <w:color w:val="1E1E1E"/>
-                <w:sz w:val="19"/>
-              </w:rPr>
+              <w:t>// LABA-6.3.cpp</w:t>
+              <w:br/>
+              <w:t>// Шах Владислав Ігорьович</w:t>
+              <w:br/>
+              <w:t>// Лабораторна робота № 6.3</w:t>
+              <w:br/>
+              <w:t>// Опрацювання одновимірних масивів за допомогою звичайних функцій та шаблонів</w:t>
+              <w:br/>
+              <w:t>// Варіант 32 (Рекурсивний спосіб)</w:t>
+              <w:br/>
+              <w:br/>
               <w:t>#include &lt;iostream&gt;</w:t>
               <w:br/>
               <w:t>#include &lt;iomanip&gt;</w:t>
@@ -1097,43 +1100,78 @@
               <w:t>using namespace std;</w:t>
               <w:br/>
               <w:br/>
-              <w:t>// Прототипи звичайних функцій</w:t>
+              <w:t>// =========================================================================</w:t>
+              <w:br/>
+              <w:t>// 1. Прототипи звичайних функцій (для типу int)</w:t>
+              <w:br/>
+              <w:t>// =========================================================================</w:t>
+              <w:br/>
+              <w:br/>
+              <w:t>// Формування масиву випадковими числами (окрема функція)</w:t>
               <w:br/>
               <w:t>void Create(int* a, const int size, const int Low, const int High, int i);</w:t>
               <w:br/>
-              <w:t>void Print(int* a, const int size, int i);</w:t>
-              <w:br/>
-              <w:t>int Min(int* a, const int size, int i, int min);</w:t>
-              <w:br/>
-              <w:t>int Min(int* a, const int size);</w:t>
-              <w:br/>
-              <w:br/>
-              <w:t>// Прототипи шаблонних функцій</w:t>
+              <w:br/>
+              <w:t>// Виведення масиву у вигляді рядка з форматним виведенням (окрема функція)</w:t>
+              <w:br/>
+              <w:t>void Print(const int* a, const int size, int i);</w:t>
+              <w:br/>
+              <w:br/>
+              <w:t>// Обчислення / пошук найменшого елемента масиву (окрема функція)</w:t>
+              <w:br/>
+              <w:t>int Min(const int* a, const int size, int i);</w:t>
+              <w:br/>
+              <w:t>int Min(const int* a, const int size);</w:t>
+              <w:br/>
+              <w:t>int Min(const int* a, const int size, int i, int min);</w:t>
+              <w:br/>
+              <w:br/>
+              <w:t>// =========================================================================</w:t>
+              <w:br/>
+              <w:t>// 2. Прототипи шаблонів функцій (для довільних типів даних)</w:t>
+              <w:br/>
+              <w:t>// =========================================================================</w:t>
+              <w:br/>
+              <w:br/>
+              <w:t>// Шаблон функції формування масиву (окрема функція)</w:t>
               <w:br/>
               <w:t>template &lt;typename T&gt;</w:t>
               <w:br/>
               <w:t>void Create(T* a, const int size, const T Low, const T High, int i);</w:t>
               <w:br/>
               <w:br/>
+              <w:t>// Шаблон функції виведення масиву (окрема функція)</w:t>
+              <w:br/>
               <w:t>template &lt;typename T&gt;</w:t>
               <w:br/>
-              <w:t>void Print(T* a, const int size, int i);</w:t>
-              <w:br/>
+              <w:t>void Print(const T* a, const int size, int i);</w:t>
+              <w:br/>
+              <w:br/>
+              <w:t>// Шаблон функції обчислення / пошуку найменшого елемента (окрема функція)</w:t>
               <w:br/>
               <w:t>template &lt;typename T&gt;</w:t>
               <w:br/>
-              <w:t>T Min(T* a, const int size, int i, T min);</w:t>
+              <w:t>T Min(const T* a, const int size, int i);</w:t>
               <w:br/>
               <w:br/>
               <w:t>template &lt;typename T&gt;</w:t>
               <w:br/>
-              <w:t>T Min(T* a, const int size);</w:t>
-              <w:br/>
-              <w:br/>
-              <w:t>// --- Реалізація звичайних функцій (для int) ---</w:t>
-              <w:br/>
-              <w:br/>
-              <w:t>// Рекурсивне формування масиву</w:t>
+              <w:t>T Min(const T* a, const int size);</w:t>
+              <w:br/>
+              <w:br/>
+              <w:t>template &lt;typename T&gt;</w:t>
+              <w:br/>
+              <w:t>T Min(const T* a, const int size, int i, T min);</w:t>
+              <w:br/>
+              <w:br/>
+              <w:t>// =========================================================================</w:t>
+              <w:br/>
+              <w:t>// 3. Реалізація звичайних функцій (тип int)</w:t>
+              <w:br/>
+              <w:t>// =========================================================================</w:t>
+              <w:br/>
+              <w:br/>
+              <w:t>// Рекурсивне формування масиву випадковими цілими числами</w:t>
               <w:br/>
               <w:t>void Create(int* a, const int size, const int Low, const int High, int i)</w:t>
               <w:br/>
@@ -1148,9 +1186,9 @@
               <w:t>}</w:t>
               <w:br/>
               <w:br/>
-              <w:t>// Рекурсивне виведення масиву</w:t>
-              <w:br/>
-              <w:t>void Print(int* a, const int size, int i)</w:t>
+              <w:t>// Рекурсивне виведення елементів масиву у консоль</w:t>
+              <w:br/>
+              <w:t>void Print(const int* a, const int size, int i)</w:t>
               <w:br/>
               <w:t>{</w:t>
               <w:br/>
@@ -1167,12 +1205,44 @@
               <w:t>}</w:t>
               <w:br/>
               <w:br/>
-              <w:t>// Рекурсивний пошук найменшого елемента (Варіант 32)</w:t>
-              <w:br/>
-              <w:t>int Min(int* a, const int size, int i, int min)</w:t>
+              <w:t>// Рекурсивний пошук мінімального елемента масиву (чиста рекурсія за методичкою)</w:t>
+              <w:br/>
+              <w:t>int Min(const int* a, const int size, int i)</w:t>
               <w:br/>
               <w:t>{</w:t>
               <w:br/>
+              <w:t xml:space="preserve">    if (i &gt;= size - 1)</w:t>
+              <w:br/>
+              <w:t xml:space="preserve">        return a[size - 1];</w:t>
+              <w:br/>
+              <w:t xml:space="preserve">    int min = Min(a, size, i + 1);</w:t>
+              <w:br/>
+              <w:t xml:space="preserve">    return (a[i] &lt; min) ? a[i] : min;</w:t>
+              <w:br/>
+              <w:t>}</w:t>
+              <w:br/>
+              <w:br/>
+              <w:t>// Перевантажена функція для зручного виклику без додаткових параметрів</w:t>
+              <w:br/>
+              <w:t>int Min(const int* a, const int size)</w:t>
+              <w:br/>
+              <w:t>{</w:t>
+              <w:br/>
+              <w:t xml:space="preserve">    if (size &lt;= 0)</w:t>
+              <w:br/>
+              <w:t xml:space="preserve">        return 0;</w:t>
+              <w:br/>
+              <w:t xml:space="preserve">    return Min(a, size, 0);</w:t>
+              <w:br/>
+              <w:t>}</w:t>
+              <w:br/>
+              <w:br/>
+              <w:t>// Рекурсивний пошук з параметром-акумулятором (для сумісності з юніт-тестами)</w:t>
+              <w:br/>
+              <w:t>int Min(const int* a, const int size, int i, int min)</w:t>
+              <w:br/>
+              <w:t>{</w:t>
+              <w:br/>
               <w:t xml:space="preserve">    if (i &gt;= size)</w:t>
               <w:br/>
               <w:t xml:space="preserve">        return min;</w:t>
@@ -1192,156 +1262,205 @@
               <w:t>}</w:t>
               <w:br/>
               <w:br/>
-              <w:t>// Допоміжна перевантажена функція для зручного виклику</w:t>
-              <w:br/>
-              <w:t>int Min(int* a, const int size)</w:t>
+              <w:t>// =========================================================================</w:t>
+              <w:br/>
+              <w:t>// 4. Реалізація шаблонів функцій</w:t>
+              <w:br/>
+              <w:t>// =========================================================================</w:t>
+              <w:br/>
+              <w:br/>
+              <w:t>// Шаблон рекурсивного формування масиву</w:t>
+              <w:br/>
+              <w:t>template &lt;typename T&gt;</w:t>
+              <w:br/>
+              <w:t>void Create(T* a, const int size, const T Low, const T High, int i)</w:t>
               <w:br/>
               <w:t>{</w:t>
               <w:br/>
-              <w:t xml:space="preserve">    return Min(a, size, 1, a[0]);</w:t>
+              <w:t xml:space="preserve">    a[i] = Low + static_cast&lt;T&gt;(rand()) * (High - Low) / static_cast&lt;T&gt;(RAND_MAX);</w:t>
+              <w:br/>
+              <w:t xml:space="preserve">    if (i &lt; size - 1)</w:t>
+              <w:br/>
+              <w:t xml:space="preserve">        Create&lt;T&gt;(a, size, Low, High, i + 1);</w:t>
               <w:br/>
               <w:t>}</w:t>
               <w:br/>
               <w:br/>
-              <w:t>// --- Реалізація шаблонних функцій ---</w:t>
-              <w:br/>
-              <w:br/>
-              <w:t>// Рекурсивне формування масиву через шаблон</w:t>
+              <w:t>// Шаблон рекурсивного виведення масиву</w:t>
               <w:br/>
               <w:t>template &lt;typename T&gt;</w:t>
               <w:br/>
-              <w:t>void Create(T* a, const int size, const T Low, const T High, int i)</w:t>
+              <w:t>void Print(const T* a, const int size, int i)</w:t>
               <w:br/>
               <w:t>{</w:t>
               <w:br/>
-              <w:t xml:space="preserve">    a[i] = Low + static_cast&lt;T&gt;(rand()) / (static_cast&lt;T&gt;(RAND_MAX / (High - Low)));</w:t>
+              <w:t xml:space="preserve">    cout &lt;&lt; setw(7) &lt;&lt; setprecision(2) &lt;&lt; fixed &lt;&lt; a[i];</w:t>
               <w:br/>
               <w:t xml:space="preserve">    if (i &lt; size - 1)</w:t>
               <w:br/>
-              <w:t xml:space="preserve">        Create&lt;T&gt;(a, size, Low, High, i + 1);</w:t>
+              <w:t xml:space="preserve">        Print&lt;T&gt;(a, size, i + 1);</w:t>
+              <w:br/>
+              <w:t xml:space="preserve">    else</w:t>
+              <w:br/>
+              <w:t xml:space="preserve">        cout &lt;&lt; endl;</w:t>
               <w:br/>
               <w:t>}</w:t>
               <w:br/>
               <w:br/>
-              <w:t>// Рекурсивне виведення масиву через шаблон</w:t>
+              <w:t>// Шаблон рекурсивного пошуку найменшого елемента (чиста рекурсія за методичкою)</w:t>
               <w:br/>
               <w:t>template &lt;typename T&gt;</w:t>
               <w:br/>
-              <w:t>void Print(T* a, const int size, int i)</w:t>
+              <w:t>T Min(const T* a, const int size, int i)</w:t>
               <w:br/>
               <w:t>{</w:t>
               <w:br/>
-              <w:t xml:space="preserve">    cout &lt;&lt; setw(7) &lt;&lt; setprecision(2) &lt;&lt; fixed &lt;&lt; a[i];</w:t>
+              <w:t xml:space="preserve">    if (i &gt;= size - 1)</w:t>
+              <w:br/>
+              <w:t xml:space="preserve">        return a[size - 1];</w:t>
+              <w:br/>
+              <w:t xml:space="preserve">    T min = Min&lt;T&gt;(a, size, i + 1);</w:t>
+              <w:br/>
+              <w:t xml:space="preserve">    return (a[i] &lt; min) ? a[i] : min;</w:t>
+              <w:br/>
+              <w:t>}</w:t>
+              <w:br/>
+              <w:br/>
+              <w:t>// Перевантажений шаблон для зручного виклику</w:t>
+              <w:br/>
+              <w:t>template &lt;typename T&gt;</w:t>
+              <w:br/>
+              <w:t>T Min(const T* a, const int size)</w:t>
+              <w:br/>
+              <w:t>{</w:t>
+              <w:br/>
+              <w:t xml:space="preserve">    if (size &lt;= 0)</w:t>
+              <w:br/>
+              <w:t xml:space="preserve">        return T();</w:t>
+              <w:br/>
+              <w:t xml:space="preserve">    return Min&lt;T&gt;(a, size, 0);</w:t>
+              <w:br/>
+              <w:t>}</w:t>
+              <w:br/>
+              <w:br/>
+              <w:t>// Шаблон рекурсивного пошуку з акумулятором</w:t>
+              <w:br/>
+              <w:t>template &lt;typename T&gt;</w:t>
+              <w:br/>
+              <w:t>T Min(const T* a, const int size, int i, T min)</w:t>
+              <w:br/>
+              <w:t>{</w:t>
+              <w:br/>
+              <w:t xml:space="preserve">    if (i &gt;= size)</w:t>
+              <w:br/>
+              <w:t xml:space="preserve">        return min;</w:t>
+              <w:br/>
+              <w:t xml:space="preserve">    if (a[i] &lt; min)</w:t>
+              <w:br/>
+              <w:t xml:space="preserve">        min = a[i];</w:t>
               <w:br/>
               <w:t xml:space="preserve">    if (i &lt; size - 1)</w:t>
               <w:br/>
-              <w:t xml:space="preserve">        Print&lt;T&gt;(a, size, i + 1);</w:t>
+              <w:t xml:space="preserve">        return Min&lt;T&gt;(a, size, i + 1, min);</w:t>
               <w:br/>
               <w:t xml:space="preserve">    else</w:t>
               <w:br/>
-              <w:t xml:space="preserve">        cout &lt;&lt; endl;</w:t>
+              <w:t xml:space="preserve">        return min;</w:t>
               <w:br/>
               <w:t>}</w:t>
               <w:br/>
               <w:br/>
-              <w:t>// Рекурсивний пошук найменшого елемента через шаблон (Варіант 32)</w:t>
-              <w:br/>
-              <w:t>template &lt;typename T&gt;</w:t>
-              <w:br/>
-              <w:t>T Min(T* a, const int size, int i, T min)</w:t>
+              <w:t>// =========================================================================</w:t>
+              <w:br/>
+              <w:t>// 5. Головна функція програми (виключно координація викликів функцій)</w:t>
+              <w:br/>
+              <w:t>// =========================================================================</w:t>
+              <w:br/>
+              <w:t>#ifndef UNIT_TESTING</w:t>
+              <w:br/>
+              <w:t>int main()</w:t>
               <w:br/>
               <w:t>{</w:t>
               <w:br/>
-              <w:t xml:space="preserve">    if (i &gt;= size)</w:t>
-              <w:br/>
-              <w:t xml:space="preserve">        return min;</w:t>
-              <w:br/>
-              <w:t xml:space="preserve">    if (a[i] &lt; min)</w:t>
-              <w:br/>
-              <w:t xml:space="preserve">        min = a[i];</w:t>
-              <w:br/>
-              <w:t xml:space="preserve">    if (i &lt; size - 1)</w:t>
-              <w:br/>
-              <w:t xml:space="preserve">        return Min&lt;T&gt;(a, size, i + 1, min);</w:t>
-              <w:br/>
-              <w:t xml:space="preserve">    else</w:t>
-              <w:br/>
-              <w:t xml:space="preserve">        return min;</w:t>
+              <w:t xml:space="preserve">    srand((unsigned)time(NULL));</w:t>
+              <w:br/>
+              <w:br/>
+              <w:t xml:space="preserve">    const int n = 10;</w:t>
+              <w:br/>
+              <w:t xml:space="preserve">    int a[n];</w:t>
+              <w:br/>
+              <w:t xml:space="preserve">    const int Low = -20;</w:t>
+              <w:br/>
+              <w:t xml:space="preserve">    const int High = 30;</w:t>
+              <w:br/>
+              <w:br/>
+              <w:t xml:space="preserve">    cout &lt;&lt; "=== Laboratorna robota 6.3 (Variant 32 - Recursion) ===" &lt;&lt; endl;</w:t>
+              <w:br/>
+              <w:t xml:space="preserve">    cout &lt;&lt; "--- 1. Standartni funktsii (int) ---" &lt;&lt; endl;</w:t>
+              <w:br/>
+              <w:t xml:space="preserve">    </w:t>
+              <w:br/>
+              <w:t xml:space="preserve">    // Формування масиву в окремій функції</w:t>
+              <w:br/>
+              <w:t xml:space="preserve">    Create(a, n, Low, High, 0);</w:t>
+              <w:br/>
+              <w:t xml:space="preserve">    </w:t>
+              <w:br/>
+              <w:t xml:space="preserve">    // Виведення початкового масиву в окремій функції</w:t>
+              <w:br/>
+              <w:t xml:space="preserve">    cout &lt;&lt; "Masiv a:" &lt;&lt; endl;</w:t>
+              <w:br/>
+              <w:t xml:space="preserve">    Print(a, n, 0);</w:t>
+              <w:br/>
+              <w:br/>
+              <w:t xml:space="preserve">    // Обчислення мінімального елемента в окремій функції</w:t>
+              <w:br/>
+              <w:t xml:space="preserve">    int minInt = Min(a, n);</w:t>
+              <w:br/>
+              <w:t xml:space="preserve">    cout &lt;&lt; "Min(a, n) = " &lt;&lt; minInt &lt;&lt; endl &lt;&lt; endl;</w:t>
+              <w:br/>
+              <w:br/>
+              <w:t xml:space="preserve">    cout &lt;&lt; "--- 2. Shabloni funktsiy ---" &lt;&lt; endl;</w:t>
+              <w:br/>
+              <w:t xml:space="preserve">    // Обчислення за допомогою шаблону</w:t>
+              <w:br/>
+              <w:t xml:space="preserve">    cout &lt;&lt; "Min&lt;int&gt;(a, n) = " &lt;&lt; Min&lt;int&gt;(a, n) &lt;&lt; endl;</w:t>
+              <w:br/>
+              <w:br/>
+              <w:t xml:space="preserve">    double b[n];</w:t>
+              <w:br/>
+              <w:t xml:space="preserve">    const double dLow = -15.5;</w:t>
+              <w:br/>
+              <w:t xml:space="preserve">    const double dHigh = 25.5;</w:t>
+              <w:br/>
+              <w:t xml:space="preserve">    </w:t>
+              <w:br/>
+              <w:t xml:space="preserve">    // Формування масиву дійсних чисел через шаблон в окремій функції</w:t>
+              <w:br/>
+              <w:t xml:space="preserve">    Create&lt;double&gt;(b, n, dLow, dHigh, 0);</w:t>
+              <w:br/>
+              <w:t xml:space="preserve">    </w:t>
+              <w:br/>
+              <w:t xml:space="preserve">    // Виведення масиву дійсних чисел через шаблон в окремій функції</w:t>
+              <w:br/>
+              <w:t xml:space="preserve">    cout &lt;&lt; "Masiv b (double):" &lt;&lt; endl;</w:t>
+              <w:br/>
+              <w:t xml:space="preserve">    Print&lt;double&gt;(b, n, 0);</w:t>
+              <w:br/>
+              <w:br/>
+              <w:t xml:space="preserve">    // Обчислення мінімального елемента через шаблон в окремій функції</w:t>
+              <w:br/>
+              <w:t xml:space="preserve">    double minDouble = Min&lt;double&gt;(b, n);</w:t>
+              <w:br/>
+              <w:t xml:space="preserve">    cout &lt;&lt; "Min&lt;double&gt;(b, n) = " &lt;&lt; minDouble &lt;&lt; endl;</w:t>
+              <w:br/>
+              <w:br/>
+              <w:t xml:space="preserve">    return 0;</w:t>
               <w:br/>
               <w:t>}</w:t>
               <w:br/>
-              <w:br/>
-              <w:t>// Допоміжна перевантажена шаблонна функція</w:t>
-              <w:br/>
-              <w:t>template &lt;typename T&gt;</w:t>
-              <w:br/>
-              <w:t>T Min(T* a, const int size)</w:t>
-              <w:br/>
-              <w:t>{</w:t>
-              <w:br/>
-              <w:t xml:space="preserve">    return Min&lt;T&gt;(a, size, 1, a[0]);</w:t>
-              <w:br/>
-              <w:t>}</w:t>
-              <w:br/>
-              <w:br/>
-              <w:t>#ifndef UNIT_TESTING</w:t>
-              <w:br/>
-              <w:t>int main()</w:t>
-              <w:br/>
-              <w:t>{</w:t>
-              <w:br/>
-              <w:t xml:space="preserve">    srand((unsigned)time(NULL));</w:t>
-              <w:br/>
-              <w:br/>
-              <w:t xml:space="preserve">    const int n = 10;</w:t>
-              <w:br/>
-              <w:t xml:space="preserve">    int a[n];</w:t>
-              <w:br/>
-              <w:t xml:space="preserve">    int Low = -20, High = 30;</w:t>
-              <w:br/>
-              <w:br/>
-              <w:t xml:space="preserve">    cout &lt;&lt; "=== Laboratorna robota 6.3 (Variant 32 - Recursion) ===" &lt;&lt; endl;</w:t>
-              <w:br/>
-              <w:t xml:space="preserve">    cout &lt;&lt; "--- 1. Standartni funktsii (int) ---" &lt;&lt; endl;</w:t>
-              <w:br/>
-              <w:t xml:space="preserve">    Create(a, n, Low, High, 0);</w:t>
-              <w:br/>
-              <w:t xml:space="preserve">    cout &lt;&lt; "Masiv a:" &lt;&lt; endl;</w:t>
-              <w:br/>
-              <w:t xml:space="preserve">    Print(a, n, 0);</w:t>
-              <w:br/>
-              <w:br/>
-              <w:t xml:space="preserve">    int minInt = Min(a, n, 1, a[0]);</w:t>
-              <w:br/>
-              <w:t xml:space="preserve">    cout &lt;&lt; "Min(a, n) = " &lt;&lt; minInt &lt;&lt; endl &lt;&lt; endl;</w:t>
-              <w:br/>
-              <w:br/>
-              <w:t xml:space="preserve">    cout &lt;&lt; "--- 2. Shabloni funktsiy ---" &lt;&lt; endl;</w:t>
-              <w:br/>
-              <w:t xml:space="preserve">    cout &lt;&lt; "Min&lt;int&gt;(a, n) = " &lt;&lt; Min&lt;int&gt;(a, n, 1, a[0]) &lt;&lt; endl;</w:t>
-              <w:br/>
-              <w:br/>
-              <w:t xml:space="preserve">    double b[n];</w:t>
-              <w:br/>
-              <w:t xml:space="preserve">    double dLow = -15.5, dHigh = 25.5;</w:t>
-              <w:br/>
-              <w:t xml:space="preserve">    Create&lt;double&gt;(b, n, dLow, dHigh, 0);</w:t>
-              <w:br/>
-              <w:t xml:space="preserve">    cout &lt;&lt; "Masiv b (double):" &lt;&lt; endl;</w:t>
-              <w:br/>
-              <w:t xml:space="preserve">    Print&lt;double&gt;(b, n, 0);</w:t>
-              <w:br/>
-              <w:br/>
-              <w:t xml:space="preserve">    double minDouble = Min&lt;double&gt;(b, n, 1, b[0]);</w:t>
-              <w:br/>
-              <w:t xml:space="preserve">    cout &lt;&lt; "Min&lt;double&gt;(b, n) = " &lt;&lt; minDouble &lt;&lt; endl;</w:t>
-              <w:br/>
-              <w:br/>
-              <w:t xml:space="preserve">    return 0;</w:t>
-              <w:br/>
-              <w:t>}</w:t>
-              <w:br/>
               <w:t>#endif</w:t>
+              <w:br/>
             </w:r>
           </w:p>
         </w:tc>

</xml_diff>